<commit_message>
Package repo for external readers: English README first, verdict up top, embedded figures
- README.md is now the English version (Vietnamese moved to README.vi.md, cross-linked)
- NO-GO recommendation + D7 / engagement / business-impact numbers moved directly under the title
- three headline figures exported to reports/figures/ and embedded, generated by scripts/export_figures.py
- executive summary also exported to PDF (viewable on GitHub without downloading)
- automated the raw CSV -> dbo.raw_ab_test load: scripts/load_raw_to_sqlserver.py + sql/phase3_load_raw_bulk_insert.sql
- renamed phase4_02_Engagement.ipynb to lowercase, pinned requirements.txt to exact versions
- consolidated 'reports/project picture/' into reports/figures/, updated notebook savefig paths
- standardised bilingual docs: English keeps the base name, Vietnamese carries a .vi/_vi suffix
- moved the cleanup note out of the README into docs/maintenance_notes.md
- added MIT LICENSE
</commit_message>
<xml_diff>
--- a/reports/CookieCats_Phase2_EDA_Data_Quality_Report.docx
+++ b/reports/CookieCats_Phase2_EDA_Data_Quality_Report.docx
@@ -14,7 +14,7 @@
           <w:sz w:val="24"/>
           <w:szCs w:val="24"/>
         </w:rPr>
-        <w:t>CÔNG TY TACTILE ENTERTAINMENT — DỰ ÁN COOKIE CATS A/B TEST</w:t>
+        <w:t>TACTILE ENTERTAINMENT — COOKIE CATS A/B TEST PROJECT</w:t>
       </w:r>
     </w:p>
     <w:p>
@@ -38,7 +38,7 @@
           <w:sz w:val="34"/>
           <w:szCs w:val="34"/>
         </w:rPr>
-        <w:t>BÁO CÁO PHASE 2 — EDA &amp; KIỂM ĐỊNH CHẤT LƯỢNG DỮ LIỆU</w:t>
+        <w:t>PHASE 2 REPORT — EDA &amp; DATA QUALITY ASSESSMENT</w:t>
       </w:r>
     </w:p>
     <w:p>
@@ -102,7 +102,7 @@
                 <w:sz w:val="24"/>
                 <w:szCs w:val="24"/>
               </w:rPr>
-              <w:t>Dự án</w:t>
+              <w:t>Project</w:t>
             </w:r>
           </w:p>
         </w:tc>
@@ -122,7 +122,7 @@
                 <w:sz w:val="24"/>
                 <w:szCs w:val="24"/>
               </w:rPr>
-              <w:t>Cookie Cats — Mobile Game A/B Testing (dời progression gate 30 → 40)</w:t>
+              <w:t>Cookie Cats — Mobile Game A/B Testing (moving the progression gate 30 → 40)</w:t>
             </w:r>
           </w:p>
         </w:tc>
@@ -204,7 +204,7 @@
                 <w:sz w:val="24"/>
                 <w:szCs w:val="24"/>
               </w:rPr>
-              <w:t>Người thực hiện</w:t>
+              <w:t>Author</w:t>
             </w:r>
           </w:p>
         </w:tc>
@@ -255,7 +255,7 @@
                 <w:sz w:val="24"/>
                 <w:szCs w:val="24"/>
               </w:rPr>
-              <w:t>Ngày phân tích</w:t>
+              <w:t>Analysis date</w:t>
             </w:r>
           </w:p>
         </w:tc>
@@ -275,21 +275,7 @@
                 <w:sz w:val="24"/>
                 <w:szCs w:val="24"/>
               </w:rPr>
-              <w:t>06</w:t>
-            </w:r>
-            <w:r>
-              <w:rPr>
-                <w:sz w:val="24"/>
-                <w:szCs w:val="24"/>
-              </w:rPr>
-              <w:t>-</w:t>
-            </w:r>
-            <w:r>
-              <w:rPr>
-                <w:sz w:val="24"/>
-                <w:szCs w:val="24"/>
-              </w:rPr>
-              <w:t>07/08/2026</w:t>
+              <w:t>06-07/08/2026</w:t>
             </w:r>
           </w:p>
         </w:tc>
@@ -320,7 +306,7 @@
                 <w:sz w:val="24"/>
                 <w:szCs w:val="24"/>
               </w:rPr>
-              <w:t>Nguồn dữ liệu</w:t>
+              <w:t>Data source</w:t>
             </w:r>
           </w:p>
         </w:tc>
@@ -340,7 +326,7 @@
                 <w:sz w:val="24"/>
                 <w:szCs w:val="24"/>
               </w:rPr>
-              <w:t>Kaggle — Mobile Games A/B Testing: Cookie Cats (~90.000 users)</w:t>
+              <w:t>Kaggle — Mobile Games A/B Testing: Cookie Cats (~90,000 users)</w:t>
             </w:r>
           </w:p>
         </w:tc>
@@ -371,7 +357,7 @@
                 <w:sz w:val="24"/>
                 <w:szCs w:val="24"/>
               </w:rPr>
-              <w:t>MD5 dataset</w:t>
+              <w:t>Dataset MD5</w:t>
             </w:r>
           </w:p>
         </w:tc>
@@ -422,7 +408,7 @@
                 <w:sz w:val="24"/>
                 <w:szCs w:val="24"/>
               </w:rPr>
-              <w:t>Trạng thái</w:t>
+              <w:t>Status</w:t>
             </w:r>
           </w:p>
         </w:tc>
@@ -442,7 +428,7 @@
                 <w:sz w:val="24"/>
                 <w:szCs w:val="24"/>
               </w:rPr>
-              <w:t>Hoàn thành — sẵn sàng chuyển Phase 3 (Data Preparation)</w:t>
+              <w:t>Completed — ready to proceed to Phase 3 (Data Preparation)</w:t>
             </w:r>
           </w:p>
         </w:tc>
@@ -461,7 +447,7 @@
           <w:sz w:val="30"/>
           <w:szCs w:val="30"/>
         </w:rPr>
-        <w:t>1. Tóm tắt điều hành</w:t>
+        <w:t>1. Executive summary</w:t>
       </w:r>
     </w:p>
     <w:p>
@@ -470,7 +456,7 @@
         <w:jc w:val="both"/>
       </w:pPr>
       <w:r>
-        <w:t>Phase 2 thực hiện toàn bộ công đoạn tìm hiểu và kiểm định chất lượng dữ liệu cho tập dữ liệu A/B test của Cookie Cats trước khi bước vào phân tích thống kê chính thức. Mục tiêu là đảm bảo dữ liệu sạch, quá trình randomization hợp lệ, và mọi bất thường đều được ghi nhận cùng chính sách xử lý rõ ràng. Kết quả: dữ liệu đạt chuẩn để tiến hành hypothesis testing ở Phase 4.</w:t>
+        <w:t>Phase 2 performs the entire data understanding and data quality assessment for the Cookie Cats A/B test dataset before entering formal statistical analysis. The goal is to ensure the data is clean, the randomization is valid, and every anomaly is recorded with a clear handling policy. Result: the data meets the standard to proceed with hypothesis testing in Phase 4.</w:t>
       </w:r>
     </w:p>
     <w:p>
@@ -479,7 +465,7 @@
         <w:jc w:val="both"/>
       </w:pPr>
       <w:r>
-        <w:t>Bốn kết luận chính:</w:t>
+        <w:t>Four main conclusions:</w:t>
       </w:r>
     </w:p>
     <w:p>
@@ -497,10 +483,10 @@
           <w:b/>
           <w:bCs/>
         </w:rPr>
-        <w:t>Chất lượng dữ liệu tốt:</w:t>
-      </w:r>
-      <w:r>
-        <w:t xml:space="preserve"> 90.189 bản ghi, không null, không trùng userid, cột version sạch (chỉ gate_30 / gate_40), không có giá trị âm.</w:t>
+        <w:t>Good data quality:</w:t>
+      </w:r>
+      <w:r>
+        <w:t xml:space="preserve"> 90,189 records, no nulls, no duplicate userids, a clean version column (only gate_30 / gate_40), no negative values.</w:t>
       </w:r>
     </w:p>
     <w:p>
@@ -518,10 +504,10 @@
           <w:b/>
           <w:bCs/>
         </w:rPr>
-        <w:t>Randomization hợp lệ:</w:t>
-      </w:r>
-      <w:r>
-        <w:t xml:space="preserve"> SRM check (chi-square) cho p = 0,009, cao hơn ngưỡng nghiêm ngặt p &lt; 0,001 đã thống nhất → không có Sample Ratio Mismatch. Kiểm tra thêm trên 6 segment đều pass.</w:t>
+        <w:t>Valid randomization:</w:t>
+      </w:r>
+      <w:r>
+        <w:t xml:space="preserve"> The SRM check (chi-square) gives p = 0.009, higher than the strict agreed threshold p &lt; 0.001 → no Sample Ratio Mismatch. Additional checks on 6 segments all pass.</w:t>
       </w:r>
     </w:p>
     <w:p>
@@ -539,10 +525,10 @@
           <w:b/>
           <w:bCs/>
         </w:rPr>
-        <w:t>Engagement lệch phải mạnh, tập trung cao:</w:t>
-      </w:r>
-      <w:r>
-        <w:t xml:space="preserve"> sum_gamerounds median chỉ 16 rounds nhưng top 20% user chiếm 74,1% tổng số rounds; ~4,4% user cài đặt nhưng không chơi round nào (zero-play).</w:t>
+        <w:t>Engagement is strongly right-skewed and highly concentrated:</w:t>
+      </w:r>
+      <w:r>
+        <w:t xml:space="preserve"> sum_gamerounds median is only 16 rounds but the top 20% of users account for 74.1% of all rounds; ~4.4% of users install but play no rounds (zero-play).</w:t>
       </w:r>
     </w:p>
     <w:p>
@@ -561,10 +547,10 @@
           <w:bCs/>
         </w:rPr>
         <w:lastRenderedPageBreak/>
-        <w:t>Tín hiệu sơ bộ (chưa kiểm định):</w:t>
-      </w:r>
-      <w:r>
-        <w:t xml:space="preserve"> gate_40 có retention D1 thấp hơn 0,59 pp và D7 thấp hơn 0,82 pp so với gate_30; hướng chênh lệch âm nhất quán trên hầu hết các bucket engagement. Đây là descriptive, sẽ được kiểm định ở Phase 4.</w:t>
+        <w:t>Preliminary signals (not yet tested):</w:t>
+      </w:r>
+      <w:r>
+        <w:t xml:space="preserve"> gate_40 has D1 retention 0.59 pp lower and D7 0.82 pp lower than gate_30; the negative direction of the difference is consistent across most engagement buckets. This is descriptive and will be tested in Phase 4.</w:t>
       </w:r>
     </w:p>
     <w:p>
@@ -573,7 +559,7 @@
         <w:jc w:val="both"/>
       </w:pPr>
       <w:r>
-        <w:t>Một quyết định policy quan trọng: loại đúng 1 user cực trị (49.854 rounds trong 14 ngày ≈ 89 giờ chơi/ngày — nghi bot/emulator), giữ lại 90.188 user cho phân tích. Tác động lên retention rate là không đáng kể.</w:t>
+        <w:t>One important policy decision: exclude exactly 1 extreme user (49,854 rounds in 14 days ≈ 89 hours of play/day — suspected bot/emulator), keeping 90,188 users for the analysis. The impact on the retention rate is negligible.</w:t>
       </w:r>
     </w:p>
     <w:p>
@@ -589,7 +575,7 @@
           <w:sz w:val="30"/>
           <w:szCs w:val="30"/>
         </w:rPr>
-        <w:t>2. Bối cảnh &amp; phạm vi Phase 2</w:t>
+        <w:t>2. Context &amp; scope of Phase 2</w:t>
       </w:r>
     </w:p>
     <w:p>
@@ -598,7 +584,7 @@
         <w:jc w:val="both"/>
       </w:pPr>
       <w:r>
-        <w:t>Cookie Cats là game puzzle match-3 của Tactile Entertainment. Tập dữ liệu ghi lại một A/B test thực tế: nhóm control (gate_30) đặt progression gate ở level 30, nhóm treatment (gate_40) dời gate sang level 40. Câu hỏi kinh doanh cốt lõi: việc dời gate có cải thiện retention (D1, D7) và engagement của người chơi hay không?</w:t>
+        <w:t>Cookie Cats is a match-3 puzzle game by Tactile Entertainment. The dataset records a real A/B test: the control group (gate_30) places the progression gate at level 30, the treatment group (gate_40) moves the gate to level 40. The core business question: does moving the gate improve player retention (D1, D7) and engagement?</w:t>
       </w:r>
     </w:p>
     <w:p>
@@ -607,7 +593,7 @@
         <w:jc w:val="both"/>
       </w:pPr>
       <w:r>
-        <w:t>Theo quy trình CRISP-DM, Phase 2 không đưa ra kết luận Go/No-Go — nhiệm vụ của nó là xác nhận nền tảng dữ liệu đủ vững để những kết luận ở các phase sau đáng tin cậy. Phase 2 được chia thành bốn nhóm công việc, tất cả hợp nhất vào báo cáo này:</w:t>
+        <w:t>Per the CRISP-DM process, Phase 2 does not make a Go/No-Go conclusion — its task is to confirm the data foundation is solid enough for later-phase conclusions to be trustworthy. Phase 2 is split into four work groups, all merged into this report:</w:t>
       </w:r>
     </w:p>
     <w:p>
@@ -625,10 +611,10 @@
           <w:b/>
           <w:bCs/>
         </w:rPr>
-        <w:t>Nhóm 1 — Data Integrity:</w:t>
-      </w:r>
-      <w:r>
-        <w:t xml:space="preserve"> null, duplicate, tính hợp lệ của giá trị, sanity &amp; logic consistency.</w:t>
+        <w:t>Group 1 — Data Integrity:</w:t>
+      </w:r>
+      <w:r>
+        <w:t xml:space="preserve"> nulls, duplicates, value validity, sanity &amp; logic consistency.</w:t>
       </w:r>
     </w:p>
     <w:p>
@@ -646,10 +632,10 @@
           <w:b/>
           <w:bCs/>
         </w:rPr>
-        <w:t>Nhóm 2 — SRM Check:</w:t>
-      </w:r>
-      <w:r>
-        <w:t xml:space="preserve"> kiểm định randomization bằng chi-square goodness-of-fit, tổng thể và theo segment.</w:t>
+        <w:t>Group 2 — SRM Check:</w:t>
+      </w:r>
+      <w:r>
+        <w:t xml:space="preserve"> randomization test via chi-square goodness-of-fit, overall and by segment.</w:t>
       </w:r>
     </w:p>
     <w:p>
@@ -667,10 +653,10 @@
           <w:b/>
           <w:bCs/>
         </w:rPr>
-        <w:t>Nhóm 3 — Distribution Analysis:</w:t>
-      </w:r>
-      <w:r>
-        <w:t xml:space="preserve"> percentile, skewness/kurtosis, histogram, Pareto, zero-inflation, retention theo bucket engagement.</w:t>
+        <w:t>Group 3 — Distribution Analysis:</w:t>
+      </w:r>
+      <w:r>
+        <w:t xml:space="preserve"> percentiles, skewness/kurtosis, histogram, Pareto, zero-inflation, retention by engagement bucket.</w:t>
       </w:r>
     </w:p>
     <w:p>
@@ -688,10 +674,10 @@
           <w:b/>
           <w:bCs/>
         </w:rPr>
-        <w:t>Nhóm 4 — Outlier &amp; Anomaly:</w:t>
-      </w:r>
-      <w:r>
-        <w:t xml:space="preserve"> profiling user cực trị, ngưỡng lọc, boxplot, sensitivity check và chốt policy xử lý outlier.</w:t>
+        <w:t>Group 4 — Outlier &amp; Anomaly:</w:t>
+      </w:r>
+      <w:r>
+        <w:t xml:space="preserve"> profiling extreme users, filter thresholds, boxplot, sensitivity check and finalizing the outlier handling policy.</w:t>
       </w:r>
     </w:p>
     <w:p>
@@ -707,7 +693,7 @@
           <w:sz w:val="30"/>
           <w:szCs w:val="30"/>
         </w:rPr>
-        <w:t>3. Nhóm 1 — Kiểm tra tính toàn vẹn dữ liệu (Data Integrity)</w:t>
+        <w:t>3. Group 1 — Data Integrity check</w:t>
       </w:r>
     </w:p>
     <w:p>
@@ -716,7 +702,7 @@
         <w:jc w:val="both"/>
       </w:pPr>
       <w:r>
-        <w:t>Dữ liệu được nạp với dtype khai báo tường minh để schema có tính xác định (deterministic) giữa các mirror của dataset. File được pin bằng MD5 hash để đảm bảo tái lập.</w:t>
+        <w:t>The data is loaded with explicitly declared dtypes so the schema is deterministic across mirrors of the dataset. The file is pinned by MD5 hash to ensure reproducibility.</w:t>
       </w:r>
     </w:p>
     <w:tbl>
@@ -774,7 +760,7 @@
                 <w:sz w:val="24"/>
                 <w:szCs w:val="24"/>
               </w:rPr>
-              <w:t>Hạng mục kiểm tra</w:t>
+              <w:t>Check item</w:t>
             </w:r>
           </w:p>
         </w:tc>
@@ -801,7 +787,7 @@
                 <w:sz w:val="24"/>
                 <w:szCs w:val="24"/>
               </w:rPr>
-              <w:t>Kết quả</w:t>
+              <w:t>Result</w:t>
             </w:r>
           </w:p>
         </w:tc>
@@ -828,7 +814,7 @@
                 <w:sz w:val="24"/>
                 <w:szCs w:val="24"/>
               </w:rPr>
-              <w:t>Kết luận</w:t>
+              <w:t>Conclusion</w:t>
             </w:r>
           </w:p>
         </w:tc>
@@ -859,7 +845,7 @@
                 <w:sz w:val="24"/>
                 <w:szCs w:val="24"/>
               </w:rPr>
-              <w:t>Tổng số bản ghi</w:t>
+              <w:t>Total records</w:t>
             </w:r>
           </w:p>
         </w:tc>
@@ -883,7 +869,7 @@
                 <w:sz w:val="24"/>
                 <w:szCs w:val="24"/>
               </w:rPr>
-              <w:t>90.189</w:t>
+              <w:t>90,189</w:t>
             </w:r>
           </w:p>
         </w:tc>
@@ -907,7 +893,7 @@
                 <w:sz w:val="24"/>
                 <w:szCs w:val="24"/>
               </w:rPr>
-              <w:t>Khớp baseline</w:t>
+              <w:t>Matches baseline</w:t>
             </w:r>
           </w:p>
         </w:tc>
@@ -938,7 +924,7 @@
                 <w:sz w:val="24"/>
                 <w:szCs w:val="24"/>
               </w:rPr>
-              <w:t>userid trùng lặp</w:t>
+              <w:t>Duplicate userids</w:t>
             </w:r>
           </w:p>
         </w:tc>
@@ -986,7 +972,7 @@
                 <w:sz w:val="24"/>
                 <w:szCs w:val="24"/>
               </w:rPr>
-              <w:t>Không duplicate</w:t>
+              <w:t>No duplicates</w:t>
             </w:r>
           </w:p>
         </w:tc>
@@ -1017,7 +1003,7 @@
                 <w:sz w:val="24"/>
                 <w:szCs w:val="24"/>
               </w:rPr>
-              <w:t>Giá trị null (mọi cột)</w:t>
+              <w:t>Null values (all columns)</w:t>
             </w:r>
           </w:p>
         </w:tc>
@@ -1041,7 +1027,7 @@
                 <w:sz w:val="24"/>
                 <w:szCs w:val="24"/>
               </w:rPr>
-              <w:t>0 (0,0000%)</w:t>
+              <w:t>0 (0.0000%)</w:t>
             </w:r>
           </w:p>
         </w:tc>
@@ -1065,7 +1051,7 @@
                 <w:sz w:val="24"/>
                 <w:szCs w:val="24"/>
               </w:rPr>
-              <w:t>Sạch</w:t>
+              <w:t>Clean</w:t>
             </w:r>
           </w:p>
         </w:tc>
@@ -1096,7 +1082,7 @@
                 <w:sz w:val="24"/>
                 <w:szCs w:val="24"/>
               </w:rPr>
-              <w:t>Giá trị cột version</w:t>
+              <w:t>version column values</w:t>
             </w:r>
           </w:p>
         </w:tc>
@@ -1144,7 +1130,7 @@
                 <w:sz w:val="24"/>
                 <w:szCs w:val="24"/>
               </w:rPr>
-              <w:t>Sạch, không lỗi whitespace/case</w:t>
+              <w:t>Clean, no whitespace/case errors</w:t>
             </w:r>
           </w:p>
         </w:tc>
@@ -1175,7 +1161,7 @@
                 <w:sz w:val="24"/>
                 <w:szCs w:val="24"/>
               </w:rPr>
-              <w:t>sum_gamerounds âm</w:t>
+              <w:t>Negative sum_gamerounds</w:t>
             </w:r>
           </w:p>
         </w:tc>
@@ -1223,7 +1209,7 @@
                 <w:sz w:val="24"/>
                 <w:szCs w:val="24"/>
               </w:rPr>
-              <w:t>Hợp lệ</w:t>
+              <w:t>Valid</w:t>
             </w:r>
           </w:p>
         </w:tc>
@@ -1255,7 +1241,7 @@
                 <w:szCs w:val="24"/>
               </w:rPr>
               <w:lastRenderedPageBreak/>
-              <w:t>User 0 rounds (zero-play)</w:t>
+              <w:t>Users with 0 rounds (zero-play)</w:t>
             </w:r>
           </w:p>
         </w:tc>
@@ -1279,7 +1265,7 @@
                 <w:sz w:val="24"/>
                 <w:szCs w:val="24"/>
               </w:rPr>
-              <w:t>3.994 (4,43%)</w:t>
+              <w:t>3,994 (4.43%)</w:t>
             </w:r>
           </w:p>
         </w:tc>
@@ -1303,7 +1289,7 @@
                 <w:sz w:val="24"/>
                 <w:szCs w:val="24"/>
               </w:rPr>
-              <w:t>Bình thường với mobile game</w:t>
+              <w:t>Normal for a mobile game</w:t>
             </w:r>
           </w:p>
         </w:tc>
@@ -1325,7 +1311,7 @@
           <w:bCs/>
           <w:color w:val="000000"/>
         </w:rPr>
-        <w:t>3.1. Chính sách khử trùng lặp (deduplication policy)</w:t>
+        <w:t>3.1. Deduplication policy</w:t>
       </w:r>
     </w:p>
     <w:p>
@@ -1334,7 +1320,7 @@
         <w:jc w:val="both"/>
       </w:pPr>
       <w:r>
-        <w:t>Dù dataset hiện không có bản ghi trùng, policy vẫn được ghi rõ để tái sử dụng và phòng khi rebuild pipeline: nếu userid trùng, giữ bản ghi có sum_gamerounds cao nhất (giả định bản ghi cao hơn là dữ liệu mới hơn — user đã chơi thêm rounds). Code khử trùng lặp được viết idempotent kèm assertion kiểm tra tính duy nhất của userid sau xử lý.</w:t>
+        <w:t>Although the dataset currently has no duplicate records, the policy is still documented for reuse and in case the pipeline is rebuilt: if a userid is duplicated, keep the record with the highest sum_gamerounds (assuming the higher record is more recent data — the user played more rounds). The deduplication code is written to be idempotent, with an assertion checking userid uniqueness after processing.</w:t>
       </w:r>
     </w:p>
     <w:p>
@@ -1348,7 +1334,7 @@
           <w:bCs/>
           <w:color w:val="000000"/>
         </w:rPr>
-        <w:t>3.2. Kiểm tra tính nhất quán logic</w:t>
+        <w:t>3.2. Logic consistency check</w:t>
       </w:r>
     </w:p>
     <w:p>
@@ -1357,7 +1343,7 @@
         <w:jc w:val="both"/>
       </w:pPr>
       <w:r>
-        <w:t>Hai bất thường logic được ghi nhận và xử lý như working assumption thay vì loại bỏ:</w:t>
+        <w:t>Two logic anomalies are recorded and handled as working assumptions rather than removed:</w:t>
       </w:r>
     </w:p>
     <w:p>
@@ -1375,20 +1361,20 @@
           <w:b/>
           <w:bCs/>
         </w:rPr>
-        <w:t>87 user có 0 rounds nhưng retention_1 = True</w:t>
-      </w:r>
-      <w:r>
-        <w:t xml:space="preserve"> (và 29 user retention_7 = True). Về lý thuyết là mâu thuẫn — không chơi round nào sao lại 'quay lại'. Cách diễn giải chấp nhận được: hệ thống retention nhiều khả năng theo dõi lượt </w:t>
+        <w:t>87 users with 0 rounds but retention_1 = True</w:t>
+      </w:r>
+      <w:r>
+        <w:t xml:space="preserve"> (and 29 users with retention_7 = True). Theoretically a contradiction — how can you 'return' without playing any rounds. An acceptable interpretation: the retention system most likely tracks </w:t>
       </w:r>
       <w:r>
         <w:rPr>
           <w:b/>
           <w:bCs/>
         </w:rPr>
-        <w:t>mở app</w:t>
-      </w:r>
-      <w:r>
-        <w:t xml:space="preserve"> chứ không phải lượt chơi. Đây là giả định phải mang theo và công bố trong các báo cáo sau.</w:t>
+        <w:t>app opens</w:t>
+      </w:r>
+      <w:r>
+        <w:t xml:space="preserve"> rather than rounds played. This assumption must be carried forward and disclosed in later reports.</w:t>
       </w:r>
     </w:p>
     <w:p>
@@ -1406,10 +1392,10 @@
           <w:b/>
           <w:bCs/>
         </w:rPr>
-        <w:t>3.599 user (≈4%) có retention_7 = True nhưng retention_1 = False.</w:t>
-      </w:r>
-      <w:r>
-        <w:t xml:space="preserve"> Về logic hoàn toàn hợp lệ (user bỏ D1 rồi quay lại D7). Median sum_gamerounds của nhóm này chỉ 45 → phần lớn là 'ghé xem thử', không phải tín hiệu bất thường.</w:t>
+        <w:t>3,599 users (≈4%) with retention_7 = True but retention_1 = False.</w:t>
+      </w:r>
+      <w:r>
+        <w:t xml:space="preserve"> Logically entirely valid (the user skips D1 then returns on D7). The median sum_gamerounds of this group is only 45 → mostly 'just checking it out', not an abnormal signal.</w:t>
       </w:r>
     </w:p>
     <w:p>
@@ -1431,7 +1417,7 @@
           <w:szCs w:val="30"/>
         </w:rPr>
         <w:lastRenderedPageBreak/>
-        <w:t>4. Nhóm 2 — Kiểm định Sample Ratio Mismatch (SRM)</w:t>
+        <w:t>4. Group 2 — Sample Ratio Mismatch (SRM) test</w:t>
       </w:r>
     </w:p>
     <w:p>
@@ -1440,7 +1426,7 @@
         <w:jc w:val="both"/>
       </w:pPr>
       <w:r>
-        <w:t>SRM check trả lời câu hỏi nền tảng: hai nhánh A/B có được chia đúng tỷ lệ thiết kế (50/50) hay không. Nếu tỷ lệ lệch bất thường thì randomization đã hỏng và toàn bộ A/B test mất giá trị. Dự án dùng ngưỡng nghiêm ngặt **p &lt; 0,001** thay vì 0,05 thông thường, vì cái giá của việc phân tích một thí nghiệm bị nhiễm là rất cao.</w:t>
+        <w:t>The SRM check answers a foundational question: were the two A/B arms split at the designed ratio (50/50)? If the ratio deviates abnormally, then randomization is broken and the entire A/B test loses its value. The project uses the strict threshold **p &lt; 0.001** instead of the usual 0.05, because the cost of analyzing a contaminated experiment is very high.</w:t>
       </w:r>
     </w:p>
     <w:p>
@@ -1454,7 +1440,7 @@
           <w:bCs/>
           <w:color w:val="000000"/>
         </w:rPr>
-        <w:t>4.1. Chi-square goodness-of-fit — tổng thể</w:t>
+        <w:t>4.1. Chi-square goodness-of-fit — overall</w:t>
       </w:r>
     </w:p>
     <w:tbl>
@@ -1511,7 +1497,7 @@
                 <w:sz w:val="24"/>
                 <w:szCs w:val="24"/>
               </w:rPr>
-              <w:t>Chỉ số</w:t>
+              <w:t>Metric</w:t>
             </w:r>
           </w:p>
         </w:tc>
@@ -1538,7 +1524,7 @@
                 <w:sz w:val="24"/>
                 <w:szCs w:val="24"/>
               </w:rPr>
-              <w:t>Giá trị</w:t>
+              <w:t>Value</w:t>
             </w:r>
           </w:p>
         </w:tc>
@@ -1593,7 +1579,7 @@
                 <w:sz w:val="24"/>
                 <w:szCs w:val="24"/>
               </w:rPr>
-              <w:t>44.700 / 45.489</w:t>
+              <w:t>44,700 / 45,489</w:t>
             </w:r>
           </w:p>
         </w:tc>
@@ -1648,7 +1634,7 @@
                 <w:sz w:val="24"/>
                 <w:szCs w:val="24"/>
               </w:rPr>
-              <w:t>45.094 / 45.094</w:t>
+              <w:t>45,094 / 45,094</w:t>
             </w:r>
           </w:p>
         </w:tc>
@@ -1679,7 +1665,7 @@
                 <w:sz w:val="24"/>
                 <w:szCs w:val="24"/>
               </w:rPr>
-              <w:t>Chênh lệch</w:t>
+              <w:t>Difference</w:t>
             </w:r>
           </w:p>
         </w:tc>
@@ -1734,7 +1720,7 @@
                 <w:sz w:val="24"/>
                 <w:szCs w:val="24"/>
               </w:rPr>
-              <w:t>Split ratio thực tế</w:t>
+              <w:t>Actual split ratio</w:t>
             </w:r>
           </w:p>
         </w:tc>
@@ -1758,7 +1744,7 @@
                 <w:sz w:val="24"/>
                 <w:szCs w:val="24"/>
               </w:rPr>
-              <w:t>49,56% / 50,44%</w:t>
+              <w:t>49.56% / 50.44%</w:t>
             </w:r>
           </w:p>
         </w:tc>
@@ -1813,7 +1799,7 @@
                 <w:sz w:val="24"/>
                 <w:szCs w:val="24"/>
               </w:rPr>
-              <w:t>6,902</w:t>
+              <w:t>6.902</w:t>
             </w:r>
           </w:p>
         </w:tc>
@@ -1868,7 +1854,7 @@
                 <w:sz w:val="24"/>
                 <w:szCs w:val="24"/>
               </w:rPr>
-              <w:t>0,009</w:t>
+              <w:t>0.009</w:t>
             </w:r>
           </w:p>
         </w:tc>
@@ -1899,7 +1885,7 @@
                 <w:sz w:val="24"/>
                 <w:szCs w:val="24"/>
               </w:rPr>
-              <w:t>Ngưỡng SRM</w:t>
+              <w:t>SRM threshold</w:t>
             </w:r>
           </w:p>
         </w:tc>
@@ -1923,7 +1909,7 @@
                 <w:sz w:val="24"/>
                 <w:szCs w:val="24"/>
               </w:rPr>
-              <w:t>0,001</w:t>
+              <w:t>0.001</w:t>
             </w:r>
           </w:p>
         </w:tc>
@@ -1954,7 +1940,7 @@
                 <w:sz w:val="24"/>
                 <w:szCs w:val="24"/>
               </w:rPr>
-              <w:t>Kết luận</w:t>
+              <w:t>Conclusion</w:t>
             </w:r>
           </w:p>
         </w:tc>
@@ -1995,7 +1981,7 @@
         <w:jc w:val="both"/>
       </w:pPr>
       <w:r>
-        <w:t>P-value 0,009 lớn hơn ngưỡng 0,001 nên không bác bỏ H0: phân phối giữa hai nhóm được coi là đồng đều. Lưu ý p-value này vẫn nhỏ hơn 0,05 — nếu dùng ngưỡng thông thường sẽ báo 'lệch', cho thấy tầm quan trọng của việc chọn ngưỡng phù hợp với chi phí sai lầm của bối cảnh A/B test lớn.</w:t>
+        <w:t>The p-value of 0.009 is larger than the 0.001 threshold, so H0 is not rejected: the distribution between the two groups is considered even. Note this p-value is still smaller than 0.05 — using the usual threshold it would report a 'mismatch', showing the importance of choosing a threshold appropriate to the error cost of a large A/B test context.</w:t>
       </w:r>
     </w:p>
     <w:p>
@@ -2009,7 +1995,7 @@
           <w:bCs/>
           <w:color w:val="000000"/>
         </w:rPr>
-        <w:t>4.2. SRM theo segment</w:t>
+        <w:t>4.2. SRM by segment</w:t>
       </w:r>
     </w:p>
     <w:p>
@@ -2018,7 +2004,7 @@
         <w:jc w:val="both"/>
       </w:pPr>
       <w:r>
-        <w:t>Kiểm tra thêm để phát hiện mất cân bằng ẩn ở các nhóm con quan trọng. Tất cả segment đều PASS:</w:t>
+        <w:t>An additional check to detect hidden imbalance in important sub-groups. All segments PASS:</w:t>
       </w:r>
     </w:p>
     <w:tbl>
@@ -2242,7 +2228,7 @@
                 <w:sz w:val="24"/>
                 <w:szCs w:val="24"/>
               </w:rPr>
-              <w:t>Kết luận</w:t>
+              <w:t>Conclusion</w:t>
             </w:r>
           </w:p>
         </w:tc>
@@ -2273,7 +2259,7 @@
                 <w:sz w:val="24"/>
                 <w:szCs w:val="24"/>
               </w:rPr>
-              <w:t>Toàn bộ user</w:t>
+              <w:t>All users</w:t>
             </w:r>
           </w:p>
         </w:tc>
@@ -2297,7 +2283,7 @@
                 <w:sz w:val="24"/>
                 <w:szCs w:val="24"/>
               </w:rPr>
-              <w:t>90.189</w:t>
+              <w:t>90,189</w:t>
             </w:r>
           </w:p>
         </w:tc>
@@ -2321,7 +2307,7 @@
                 <w:sz w:val="24"/>
                 <w:szCs w:val="24"/>
               </w:rPr>
-              <w:t>44.700</w:t>
+              <w:t>44,700</w:t>
             </w:r>
           </w:p>
         </w:tc>
@@ -2345,7 +2331,7 @@
                 <w:sz w:val="24"/>
                 <w:szCs w:val="24"/>
               </w:rPr>
-              <w:t>45.489</w:t>
+              <w:t>45,489</w:t>
             </w:r>
           </w:p>
         </w:tc>
@@ -2369,7 +2355,7 @@
                 <w:sz w:val="24"/>
                 <w:szCs w:val="24"/>
               </w:rPr>
-              <w:t>49,56</w:t>
+              <w:t>49.56</w:t>
             </w:r>
           </w:p>
         </w:tc>
@@ -2393,7 +2379,7 @@
                 <w:sz w:val="24"/>
                 <w:szCs w:val="24"/>
               </w:rPr>
-              <w:t>0,0086</w:t>
+              <w:t>0.0086</w:t>
             </w:r>
           </w:p>
         </w:tc>
@@ -2448,7 +2434,7 @@
                 <w:sz w:val="24"/>
                 <w:szCs w:val="24"/>
               </w:rPr>
-              <w:t>Chỉ 0 rounds</w:t>
+              <w:t>Only 0 rounds</w:t>
             </w:r>
           </w:p>
         </w:tc>
@@ -2472,7 +2458,7 @@
                 <w:sz w:val="24"/>
                 <w:szCs w:val="24"/>
               </w:rPr>
-              <w:t>3.994</w:t>
+              <w:t>3,994</w:t>
             </w:r>
           </w:p>
         </w:tc>
@@ -2496,7 +2482,7 @@
                 <w:sz w:val="24"/>
                 <w:szCs w:val="24"/>
               </w:rPr>
-              <w:t>1.937</w:t>
+              <w:t>1,937</w:t>
             </w:r>
           </w:p>
         </w:tc>
@@ -2520,7 +2506,7 @@
                 <w:sz w:val="24"/>
                 <w:szCs w:val="24"/>
               </w:rPr>
-              <w:t>2.057</w:t>
+              <w:t>2,057</w:t>
             </w:r>
           </w:p>
         </w:tc>
@@ -2544,7 +2530,7 @@
                 <w:sz w:val="24"/>
                 <w:szCs w:val="24"/>
               </w:rPr>
-              <w:t>48,50</w:t>
+              <w:t>48.50</w:t>
             </w:r>
           </w:p>
         </w:tc>
@@ -2568,7 +2554,7 @@
                 <w:sz w:val="24"/>
                 <w:szCs w:val="24"/>
               </w:rPr>
-              <w:t>0,0576</w:t>
+              <w:t>0.0576</w:t>
             </w:r>
           </w:p>
         </w:tc>
@@ -2719,7 +2705,7 @@
                 <w:sz w:val="24"/>
                 <w:szCs w:val="24"/>
               </w:rPr>
-              <w:t>47,13</w:t>
+              <w:t>47.13</w:t>
             </w:r>
           </w:p>
         </w:tc>
@@ -2743,7 +2729,7 @@
                 <w:sz w:val="24"/>
                 <w:szCs w:val="24"/>
               </w:rPr>
-              <w:t>0,5919</w:t>
+              <w:t>0.5919</w:t>
             </w:r>
           </w:p>
         </w:tc>
@@ -2894,7 +2880,7 @@
                 <w:sz w:val="24"/>
                 <w:szCs w:val="24"/>
               </w:rPr>
-              <w:t>55,17</w:t>
+              <w:t>55.17</w:t>
             </w:r>
           </w:p>
         </w:tc>
@@ -2918,7 +2904,7 @@
                 <w:sz w:val="24"/>
                 <w:szCs w:val="24"/>
               </w:rPr>
-              <w:t>0,5775</w:t>
+              <w:t>0.5775</w:t>
             </w:r>
           </w:p>
         </w:tc>
@@ -2973,7 +2959,7 @@
                 <w:sz w:val="24"/>
                 <w:szCs w:val="24"/>
               </w:rPr>
-              <w:t>≥ 30 rounds (qua gate_30)</w:t>
+              <w:t>≥ 30 rounds (past gate_30)</w:t>
             </w:r>
           </w:p>
         </w:tc>
@@ -2997,7 +2983,7 @@
                 <w:sz w:val="24"/>
                 <w:szCs w:val="24"/>
               </w:rPr>
-              <w:t>33.269</w:t>
+              <w:t>33,269</w:t>
             </w:r>
           </w:p>
         </w:tc>
@@ -3021,7 +3007,7 @@
                 <w:sz w:val="24"/>
                 <w:szCs w:val="24"/>
               </w:rPr>
-              <w:t>16.656</w:t>
+              <w:t>16,656</w:t>
             </w:r>
           </w:p>
         </w:tc>
@@ -3045,7 +3031,7 @@
                 <w:sz w:val="24"/>
                 <w:szCs w:val="24"/>
               </w:rPr>
-              <w:t>16.613</w:t>
+              <w:t>16,613</w:t>
             </w:r>
           </w:p>
         </w:tc>
@@ -3069,7 +3055,7 @@
                 <w:sz w:val="24"/>
                 <w:szCs w:val="24"/>
               </w:rPr>
-              <w:t>50,06</w:t>
+              <w:t>50.06</w:t>
             </w:r>
           </w:p>
         </w:tc>
@@ -3093,7 +3079,7 @@
                 <w:sz w:val="24"/>
                 <w:szCs w:val="24"/>
               </w:rPr>
-              <w:t>0,8136</w:t>
+              <w:t>0.8136</w:t>
             </w:r>
           </w:p>
         </w:tc>
@@ -3148,7 +3134,7 @@
                 <w:sz w:val="24"/>
                 <w:szCs w:val="24"/>
               </w:rPr>
-              <w:t>≥ 40 rounds (qua gate_40)</w:t>
+              <w:t>≥ 40 rounds (past gate_40)</w:t>
             </w:r>
           </w:p>
         </w:tc>
@@ -3172,7 +3158,7 @@
                 <w:sz w:val="24"/>
                 <w:szCs w:val="24"/>
               </w:rPr>
-              <w:t>27.393</w:t>
+              <w:t>27,393</w:t>
             </w:r>
           </w:p>
         </w:tc>
@@ -3196,7 +3182,7 @@
                 <w:sz w:val="24"/>
                 <w:szCs w:val="24"/>
               </w:rPr>
-              <w:t>13.566</w:t>
+              <w:t>13,566</w:t>
             </w:r>
           </w:p>
         </w:tc>
@@ -3220,7 +3206,7 @@
                 <w:sz w:val="24"/>
                 <w:szCs w:val="24"/>
               </w:rPr>
-              <w:t>13.827</w:t>
+              <w:t>13,827</w:t>
             </w:r>
           </w:p>
         </w:tc>
@@ -3244,7 +3230,7 @@
                 <w:sz w:val="24"/>
                 <w:szCs w:val="24"/>
               </w:rPr>
-              <w:t>49,52</w:t>
+              <w:t>49.52</w:t>
             </w:r>
           </w:p>
         </w:tc>
@@ -3268,7 +3254,7 @@
                 <w:sz w:val="24"/>
                 <w:szCs w:val="24"/>
               </w:rPr>
-              <w:t>0,1148</w:t>
+              <w:t>0.1148</w:t>
             </w:r>
           </w:p>
         </w:tc>
@@ -3314,7 +3300,7 @@
           <w:bCs/>
           <w:color w:val="000000"/>
         </w:rPr>
-        <w:t>4.3. Retention &amp; engagement theo nhóm (mô tả, chưa kiểm định)</w:t>
+        <w:t>4.3. Retention &amp; engagement by group (descriptive, not yet tested)</w:t>
       </w:r>
     </w:p>
     <w:p>
@@ -3324,7 +3310,7 @@
       </w:pPr>
       <w:r>
         <w:lastRenderedPageBreak/>
-        <w:t>Bảng dưới là descriptive để định hình kỳ vọng, KHÔNG phải kết quả kiểm định — significance sẽ được đánh giá ở Phase 4.</w:t>
+        <w:t>The table below is descriptive to shape expectations, NOT test results — significance will be assessed in Phase 4.</w:t>
       </w:r>
     </w:p>
     <w:tbl>
@@ -3385,7 +3371,7 @@
                 <w:sz w:val="24"/>
                 <w:szCs w:val="24"/>
               </w:rPr>
-              <w:t>Nhóm</w:t>
+              <w:t>Group</w:t>
             </w:r>
           </w:p>
         </w:tc>
@@ -3412,7 +3398,7 @@
                 <w:sz w:val="24"/>
                 <w:szCs w:val="24"/>
               </w:rPr>
-              <w:t>N user</w:t>
+              <w:t>N users</w:t>
             </w:r>
           </w:p>
         </w:tc>
@@ -3575,7 +3561,7 @@
                 <w:sz w:val="24"/>
                 <w:szCs w:val="24"/>
               </w:rPr>
-              <w:t>44.700</w:t>
+              <w:t>44,700</w:t>
             </w:r>
           </w:p>
         </w:tc>
@@ -3599,7 +3585,7 @@
                 <w:sz w:val="24"/>
                 <w:szCs w:val="24"/>
               </w:rPr>
-              <w:t>44,82%</w:t>
+              <w:t>44.82%</w:t>
             </w:r>
           </w:p>
         </w:tc>
@@ -3623,7 +3609,7 @@
                 <w:sz w:val="24"/>
                 <w:szCs w:val="24"/>
               </w:rPr>
-              <w:t>19,02%</w:t>
+              <w:t>19.02%</w:t>
             </w:r>
           </w:p>
         </w:tc>
@@ -3647,7 +3633,7 @@
                 <w:sz w:val="24"/>
                 <w:szCs w:val="24"/>
               </w:rPr>
-              <w:t>52,46</w:t>
+              <w:t>52.46</w:t>
             </w:r>
           </w:p>
         </w:tc>
@@ -3726,7 +3712,7 @@
                 <w:sz w:val="24"/>
                 <w:szCs w:val="24"/>
               </w:rPr>
-              <w:t>45.489</w:t>
+              <w:t>45,489</w:t>
             </w:r>
           </w:p>
         </w:tc>
@@ -3750,7 +3736,7 @@
                 <w:sz w:val="24"/>
                 <w:szCs w:val="24"/>
               </w:rPr>
-              <w:t>44,23%</w:t>
+              <w:t>44.23%</w:t>
             </w:r>
           </w:p>
         </w:tc>
@@ -3774,7 +3760,7 @@
                 <w:sz w:val="24"/>
                 <w:szCs w:val="24"/>
               </w:rPr>
-              <w:t>18,20%</w:t>
+              <w:t>18.20%</w:t>
             </w:r>
           </w:p>
         </w:tc>
@@ -3798,7 +3784,7 @@
                 <w:sz w:val="24"/>
                 <w:szCs w:val="24"/>
               </w:rPr>
-              <w:t>51,30</w:t>
+              <w:t>51.30</w:t>
             </w:r>
           </w:p>
         </w:tc>
@@ -3853,7 +3839,7 @@
                 <w:sz w:val="24"/>
                 <w:szCs w:val="24"/>
               </w:rPr>
-              <w:t>Chênh lệch (g40 − g30)</w:t>
+              <w:t>Difference (g40 − g30)</w:t>
             </w:r>
           </w:p>
         </w:tc>
@@ -3901,7 +3887,7 @@
                 <w:sz w:val="24"/>
                 <w:szCs w:val="24"/>
               </w:rPr>
-              <w:t>−0,59 pp</w:t>
+              <w:t>−0.59 pp</w:t>
             </w:r>
           </w:p>
         </w:tc>
@@ -3925,7 +3911,7 @@
                 <w:sz w:val="24"/>
                 <w:szCs w:val="24"/>
               </w:rPr>
-              <w:t>−0,82 pp</w:t>
+              <w:t>−0.82 pp</w:t>
             </w:r>
           </w:p>
         </w:tc>
@@ -3949,7 +3935,7 @@
                 <w:sz w:val="24"/>
                 <w:szCs w:val="24"/>
               </w:rPr>
-              <w:t>−1,16</w:t>
+              <w:t>−1.16</w:t>
             </w:r>
           </w:p>
         </w:tc>
@@ -3990,7 +3976,7 @@
         <w:jc w:val="both"/>
       </w:pPr>
       <w:r>
-        <w:t>Cả hai chỉ số retention của gate_40 đều thấp hơn gate_30, phù hợp với kỳ vọng directional rằng gate sớm (level 30) tạo thói quen quay lại tốt hơn. Chênh lệch nhỏ nhưng hướng nhất quán — đáng để kiểm định chính thức.</w:t>
+        <w:t>Both retention metrics of gate_40 are lower than gate_30, consistent with the directional expectation that an early gate (level 30) builds a better comeback habit. The difference is small but the direction is consistent — worth a formal test.</w:t>
       </w:r>
     </w:p>
     <w:p>
@@ -4012,7 +3998,7 @@
           <w:szCs w:val="30"/>
         </w:rPr>
         <w:lastRenderedPageBreak/>
-        <w:t>5. Nhóm 3 — Phân tích phân phối (Distribution Analysis)</w:t>
+        <w:t>5. Group 3 — Distribution Analysis</w:t>
       </w:r>
     </w:p>
     <w:p>
@@ -4026,7 +4012,7 @@
           <w:bCs/>
           <w:color w:val="000000"/>
         </w:rPr>
-        <w:t>5.1. Bảng percentile của sum_gamerounds</w:t>
+        <w:t>5.1. Percentile table of sum_gamerounds</w:t>
       </w:r>
     </w:p>
     <w:tbl>
@@ -4112,7 +4098,7 @@
                 <w:sz w:val="24"/>
                 <w:szCs w:val="24"/>
               </w:rPr>
-              <w:t>Tất cả</w:t>
+              <w:t>All</w:t>
             </w:r>
           </w:p>
         </w:tc>
@@ -5148,7 +5134,7 @@
                 <w:sz w:val="24"/>
                 <w:szCs w:val="24"/>
               </w:rPr>
-              <w:t>1.074</w:t>
+              <w:t>1,074</w:t>
             </w:r>
           </w:p>
         </w:tc>
@@ -5172,7 +5158,7 @@
                 <w:sz w:val="24"/>
                 <w:szCs w:val="24"/>
               </w:rPr>
-              <w:t>1.053</w:t>
+              <w:t>1,053</w:t>
             </w:r>
           </w:p>
         </w:tc>
@@ -5196,7 +5182,7 @@
                 <w:sz w:val="24"/>
                 <w:szCs w:val="24"/>
               </w:rPr>
-              <w:t>1.086</w:t>
+              <w:t>1,086</w:t>
             </w:r>
           </w:p>
         </w:tc>
@@ -5251,7 +5237,7 @@
                 <w:sz w:val="24"/>
                 <w:szCs w:val="24"/>
               </w:rPr>
-              <w:t>51,87</w:t>
+              <w:t>51.87</w:t>
             </w:r>
           </w:p>
         </w:tc>
@@ -5275,7 +5261,7 @@
                 <w:sz w:val="24"/>
                 <w:szCs w:val="24"/>
               </w:rPr>
-              <w:t>52,46</w:t>
+              <w:t>52.46</w:t>
             </w:r>
           </w:p>
         </w:tc>
@@ -5299,7 +5285,7 @@
                 <w:sz w:val="24"/>
                 <w:szCs w:val="24"/>
               </w:rPr>
-              <w:t>51,30</w:t>
+              <w:t>51.30</w:t>
             </w:r>
           </w:p>
         </w:tc>
@@ -5316,7 +5302,7 @@
         <w:jc w:val="both"/>
       </w:pPr>
       <w:r>
-        <w:t>Median (16) thấp hơn mean (51,87) rất nhiều — dấu hiệu điển hình của phân phối lệch phải mạnh: đa số user chơi rất ít, một thiểu số chơi cực nhiều kéo mean lên. Hai nhóm gate_30 và gate_40 gần như đồng nhất ở mọi percentile, củng cố kết luận randomization tốt.</w:t>
+        <w:t>The median (16) is much lower than the mean (51.87) — a classic sign of a strongly right-skewed distribution: most users play very little, while a minority who play a great deal pull the mean up. The two groups gate_30 and gate_40 are nearly identical at every percentile, reinforcing the good-randomization conclusion.</w:t>
       </w:r>
     </w:p>
     <w:p>
@@ -5389,7 +5375,7 @@
                 <w:sz w:val="24"/>
                 <w:szCs w:val="24"/>
               </w:rPr>
-              <w:t>Nhóm</w:t>
+              <w:t>Group</w:t>
             </w:r>
           </w:p>
         </w:tc>
@@ -5470,7 +5456,7 @@
                 <w:sz w:val="24"/>
                 <w:szCs w:val="24"/>
               </w:rPr>
-              <w:t>Diễn giải</w:t>
+              <w:t>Interpretation</w:t>
             </w:r>
           </w:p>
         </w:tc>
@@ -5525,7 +5511,7 @@
                 <w:sz w:val="24"/>
                 <w:szCs w:val="24"/>
               </w:rPr>
-              <w:t>163,70</w:t>
+              <w:t>163.70</w:t>
             </w:r>
           </w:p>
         </w:tc>
@@ -5549,7 +5535,7 @@
                 <w:sz w:val="24"/>
                 <w:szCs w:val="24"/>
               </w:rPr>
-              <w:t>31.684,84</w:t>
+              <w:t>31,684.84</w:t>
             </w:r>
           </w:p>
         </w:tc>
@@ -5573,7 +5559,7 @@
                 <w:sz w:val="24"/>
                 <w:szCs w:val="24"/>
               </w:rPr>
-              <w:t>Lệch phải cực mạnh, tail cực dày</w:t>
+              <w:t>Extremely right-skewed, extremely heavy tail</w:t>
             </w:r>
           </w:p>
         </w:tc>
@@ -5628,7 +5614,7 @@
                 <w:sz w:val="24"/>
                 <w:szCs w:val="24"/>
               </w:rPr>
-              <w:t>5,97</w:t>
+              <w:t>5.97</w:t>
             </w:r>
           </w:p>
         </w:tc>
@@ -5652,7 +5638,7 @@
                 <w:sz w:val="24"/>
                 <w:szCs w:val="24"/>
               </w:rPr>
-              <w:t>63,10</w:t>
+              <w:t>63.10</w:t>
             </w:r>
           </w:p>
         </w:tc>
@@ -5676,7 +5662,7 @@
                 <w:sz w:val="24"/>
                 <w:szCs w:val="24"/>
               </w:rPr>
-              <w:t>Lệch phải mạnh, tail dày</w:t>
+              <w:t>Strongly right-skewed, heavy tail</w:t>
             </w:r>
           </w:p>
         </w:tc>
@@ -5693,7 +5679,7 @@
         <w:jc w:val="both"/>
       </w:pPr>
       <w:r>
-        <w:t>Skewness và kurtosis của gate_30 lớn bất thường là do đúng một user 49.854 rounds nằm trong nhóm này. Sau khi loại outlier ở Nhóm 4, con số của gate_30 sẽ về mức tương đương gate_40. Hàm ý quan trọng cho Phase 4: dữ liệu KHÔNG normal → phải dùng test phi tham số (Mann-Whitney U) và bootstrap thay vì t-test.</w:t>
+        <w:t>The abnormally large skewness and kurtosis of gate_30 are due to exactly one user with 49,854 rounds in this group. After removing the outlier in Group 4, gate_30’s figures will fall to a level comparable to gate_40. An important implication for Phase 4: the data is NOT normal → non-parametric tests (Mann-Whitney U) and bootstrap must be used instead of a t-test.</w:t>
       </w:r>
     </w:p>
     <w:p>
@@ -5707,7 +5693,7 @@
           <w:bCs/>
           <w:color w:val="000000"/>
         </w:rPr>
-        <w:t>5.3. Histogram phân phối</w:t>
+        <w:t>5.3. Distribution histogram</w:t>
       </w:r>
     </w:p>
     <w:p>
@@ -5773,7 +5759,7 @@
           <w:sz w:val="22"/>
           <w:szCs w:val="22"/>
         </w:rPr>
-        <w:t>Hình 1. Histogram sum_gamerounds theo nhóm (thang tuyến tính hàng trên, thang log hàng dưới). Đường đứt đánh dấu vị trí gate level 30 và 40.</w:t>
+        <w:t>Figure 1. Histogram of sum_gamerounds by group (linear scale top row, log scale bottom row). The dashed lines mark the positions of gate levels 30 and 40.</w:t>
       </w:r>
     </w:p>
     <w:p>
@@ -5782,7 +5768,7 @@
         <w:jc w:val="both"/>
       </w:pPr>
       <w:r>
-        <w:t>Khối lượng người chơi tập trung dày đặc ở vùng rounds thấp và tan nhanh về phía tail. Thang log (hàng dưới) cho thấy tail kéo dài đều tới 500+ rounds ở cả hai nhóm — hình dạng phân phối của gate_30 và gate_40 gần như trùng khớp.</w:t>
+        <w:t>The mass of players is densely concentrated in the low-rounds region and dissipates quickly toward the tail. The log scale (bottom row) shows the tail extending evenly out to 500+ rounds in both groups — the distribution shapes of gate_30 and gate_40 are nearly identical.</w:t>
       </w:r>
     </w:p>
     <w:p>
@@ -5796,7 +5782,7 @@
           <w:bCs/>
           <w:color w:val="000000"/>
         </w:rPr>
-        <w:t>5.4. Phân tích Pareto — mức độ tập trung engagement</w:t>
+        <w:t>5.4. Pareto analysis — engagement concentration</w:t>
       </w:r>
     </w:p>
     <w:p>
@@ -5861,7 +5847,7 @@
           <w:sz w:val="22"/>
           <w:szCs w:val="22"/>
         </w:rPr>
-        <w:t>Hình 2. Đường cong Pareto — phần trăm tích lũy tổng rounds theo phần trăm user (xếp giảm dần theo mức chơi).</w:t>
+        <w:t>Figure 2. Pareto curve — cumulative percentage of total rounds by percentage of users (sorted descending by play level).</w:t>
       </w:r>
     </w:p>
     <w:tbl>
@@ -5919,7 +5905,7 @@
                 <w:szCs w:val="24"/>
               </w:rPr>
               <w:lastRenderedPageBreak/>
-              <w:t>Nhóm user (top)</w:t>
+              <w:t>User group (top)</w:t>
             </w:r>
           </w:p>
         </w:tc>
@@ -5946,7 +5932,7 @@
                 <w:sz w:val="24"/>
                 <w:szCs w:val="24"/>
               </w:rPr>
-              <w:t>% tổng rounds đóng góp</w:t>
+              <w:t>% of total rounds contributed</w:t>
             </w:r>
           </w:p>
         </w:tc>
@@ -6001,7 +5987,7 @@
                 <w:sz w:val="24"/>
                 <w:szCs w:val="24"/>
               </w:rPr>
-              <w:t>15,0%</w:t>
+              <w:t>15.0%</w:t>
             </w:r>
           </w:p>
         </w:tc>
@@ -6056,7 +6042,7 @@
                 <w:sz w:val="24"/>
                 <w:szCs w:val="24"/>
               </w:rPr>
-              <w:t>39,4%</w:t>
+              <w:t>39.4%</w:t>
             </w:r>
           </w:p>
         </w:tc>
@@ -6111,7 +6097,7 @@
                 <w:sz w:val="24"/>
                 <w:szCs w:val="24"/>
               </w:rPr>
-              <w:t>55,8%</w:t>
+              <w:t>55.8%</w:t>
             </w:r>
           </w:p>
         </w:tc>
@@ -6166,7 +6152,7 @@
                 <w:sz w:val="24"/>
                 <w:szCs w:val="24"/>
               </w:rPr>
-              <w:t>74,1%</w:t>
+              <w:t>74.1%</w:t>
             </w:r>
           </w:p>
         </w:tc>
@@ -6183,7 +6169,7 @@
         <w:jc w:val="both"/>
       </w:pPr>
       <w:r>
-        <w:t>Engagement tập trung rất cao: top 20% user tạo ra 74,1% tổng số rounds — sát với nguyên tắc Pareto 80/20. Về mặt kinh doanh, một nhóm nhỏ heavy user chi phối phần lớn hoạt động; retention/monetization của game phụ thuộc nhiều vào việc giữ chân nhóm này.</w:t>
+        <w:t>Engagement is highly concentrated: the top 20% of users generate 74.1% of all rounds — close to the Pareto 80/20 principle. In business terms, a small group of heavy users dominates most of the activity; the game’s retention/monetization depends heavily on keeping this group.</w:t>
       </w:r>
     </w:p>
     <w:p>
@@ -6197,7 +6183,7 @@
           <w:bCs/>
           <w:color w:val="000000"/>
         </w:rPr>
-        <w:t>5.5. Zero-inflation — user cài đặt nhưng không chơi</w:t>
+        <w:t>5.5. Zero-inflation — users who install but do not play</w:t>
       </w:r>
     </w:p>
     <w:tbl>
@@ -6258,7 +6244,7 @@
                 <w:sz w:val="24"/>
                 <w:szCs w:val="24"/>
               </w:rPr>
-              <w:t>Nhóm</w:t>
+              <w:t>Group</w:t>
             </w:r>
           </w:p>
         </w:tc>
@@ -6285,7 +6271,7 @@
                 <w:sz w:val="24"/>
                 <w:szCs w:val="24"/>
               </w:rPr>
-              <w:t>Tổng user</w:t>
+              <w:t>Total users</w:t>
             </w:r>
           </w:p>
         </w:tc>
@@ -6312,7 +6298,7 @@
                 <w:sz w:val="24"/>
                 <w:szCs w:val="24"/>
               </w:rPr>
-              <w:t>User 0 rounds</w:t>
+              <w:t>Users with 0 rounds</w:t>
             </w:r>
           </w:p>
         </w:tc>
@@ -6366,7 +6352,7 @@
                 <w:sz w:val="24"/>
                 <w:szCs w:val="24"/>
               </w:rPr>
-              <w:t>Trong đó R1=True</w:t>
+              <w:t>Of which R1=True</w:t>
             </w:r>
           </w:p>
         </w:tc>
@@ -6448,7 +6434,7 @@
                 <w:sz w:val="24"/>
                 <w:szCs w:val="24"/>
               </w:rPr>
-              <w:t>44.700</w:t>
+              <w:t>44,700</w:t>
             </w:r>
           </w:p>
         </w:tc>
@@ -6472,7 +6458,7 @@
                 <w:sz w:val="24"/>
                 <w:szCs w:val="24"/>
               </w:rPr>
-              <w:t>1.937</w:t>
+              <w:t>1,937</w:t>
             </w:r>
           </w:p>
         </w:tc>
@@ -6496,7 +6482,7 @@
                 <w:sz w:val="24"/>
                 <w:szCs w:val="24"/>
               </w:rPr>
-              <w:t>4,33%</w:t>
+              <w:t>4.33%</w:t>
             </w:r>
           </w:p>
         </w:tc>
@@ -6520,7 +6506,7 @@
                 <w:sz w:val="24"/>
                 <w:szCs w:val="24"/>
               </w:rPr>
-              <w:t>41 (2,12%)</w:t>
+              <w:t>41 (2.12%)</w:t>
             </w:r>
           </w:p>
         </w:tc>
@@ -6544,7 +6530,7 @@
                 <w:sz w:val="24"/>
                 <w:szCs w:val="24"/>
               </w:rPr>
-              <w:t>16 (0,83%)</w:t>
+              <w:t>16 (0.83%)</w:t>
             </w:r>
           </w:p>
         </w:tc>
@@ -6599,7 +6585,7 @@
                 <w:sz w:val="24"/>
                 <w:szCs w:val="24"/>
               </w:rPr>
-              <w:t>45.489</w:t>
+              <w:t>45,489</w:t>
             </w:r>
           </w:p>
         </w:tc>
@@ -6623,7 +6609,7 @@
                 <w:sz w:val="24"/>
                 <w:szCs w:val="24"/>
               </w:rPr>
-              <w:t>2.057</w:t>
+              <w:t>2,057</w:t>
             </w:r>
           </w:p>
         </w:tc>
@@ -6647,7 +6633,7 @@
                 <w:sz w:val="24"/>
                 <w:szCs w:val="24"/>
               </w:rPr>
-              <w:t>4,52%</w:t>
+              <w:t>4.52%</w:t>
             </w:r>
           </w:p>
         </w:tc>
@@ -6671,7 +6657,7 @@
                 <w:sz w:val="24"/>
                 <w:szCs w:val="24"/>
               </w:rPr>
-              <w:t>46 (2,24%)</w:t>
+              <w:t>46 (2.24%)</w:t>
             </w:r>
           </w:p>
         </w:tc>
@@ -6695,7 +6681,7 @@
                 <w:sz w:val="24"/>
                 <w:szCs w:val="24"/>
               </w:rPr>
-              <w:t>13 (0,63%)</w:t>
+              <w:t>13 (0.63%)</w:t>
             </w:r>
           </w:p>
         </w:tc>
@@ -6712,19 +6698,7 @@
         <w:jc w:val="both"/>
       </w:pPr>
       <w:r>
-        <w:t>Tỷ lệ zero-play ~4,3</w:t>
-      </w:r>
-      <w:r>
-        <w:t>-</w:t>
-      </w:r>
-      <w:r>
-        <w:t>4,5% ở cả hai nhóm, nằm dưới ngưỡng thông thường 5</w:t>
-      </w:r>
-      <w:r>
-        <w:t>-</w:t>
-      </w:r>
-      <w:r>
-        <w:t>15% của mobile game — chất lượng traffic/onboarding tốt. Nhóm 0 rounds nhưng vẫn 'retained' chính là 87 user bất thường đã nêu ở Nhóm 1, củng cố giả định retention theo dõi lượt mở app.</w:t>
+        <w:t>The zero-play rate of ~4.3-4.5% in both groups is below the usual 5-15% for mobile games — good traffic/onboarding quality. The 0-rounds-but-'retained' group is exactly the 87 anomalous users noted in Group 1, reinforcing the assumption that retention tracks app opens.</w:t>
       </w:r>
     </w:p>
     <w:p>
@@ -6738,7 +6712,7 @@
           <w:bCs/>
           <w:color w:val="000000"/>
         </w:rPr>
-        <w:t>5.6. Retention theo bucket engagement</w:t>
+        <w:t>5.6. Retention by engagement bucket</w:t>
       </w:r>
     </w:p>
     <w:p>
@@ -6803,7 +6777,7 @@
           <w:sz w:val="22"/>
           <w:szCs w:val="22"/>
         </w:rPr>
-        <w:t>Hình 3. Retention D1 (trái) và D7 (phải) theo bucket sum_gamerounds và nhóm version.</w:t>
+        <w:t>Figure 3. Retention D1 (left) and D7 (right) by sum_gamerounds bucket and version group.</w:t>
       </w:r>
     </w:p>
     <w:p>
@@ -6812,7 +6786,7 @@
         <w:jc w:val="both"/>
       </w:pPr>
       <w:r>
-        <w:t>Mối quan hệ rất rõ và đơn điệu: user chơi càng nhiều thì retention càng cao — từ ~2% (0 rounds) lên tới ~97% D1 và ~95% D7 ở nhóm 500+ rounds. Đây là bằng chứng mạnh cho hướng phân tích segment ở các phase sau: chênh lệch giữa hai gate (nếu có) nhiều khả năng nằm ở các bucket cụ thể chứ không đồng đều toàn tập.</w:t>
+        <w:t>The relationship is very clear and monotonic: the more a user plays, the higher the retention — from ~2% (0 rounds) up to ~97% D1 and ~95% D7 in the 500+ rounds group. This is strong evidence for the segment-analysis direction in later phases: the difference between the two gates (if any) is likely in specific buckets rather than uniform across the whole set.</w:t>
       </w:r>
     </w:p>
     <w:p>
@@ -6822,25 +6796,7 @@
       </w:pPr>
       <w:r>
         <w:lastRenderedPageBreak/>
-        <w:t>Ở retention D7, gate_30 nhỉnh hơn gate_40 ở gần như mọi bucket trung gian (15</w:t>
-      </w:r>
-      <w:r>
-        <w:t>-</w:t>
-      </w:r>
-      <w:r>
-        <w:t>29, 30</w:t>
-      </w:r>
-      <w:r>
-        <w:t>-</w:t>
-      </w:r>
-      <w:r>
-        <w:t>99, 100</w:t>
-      </w:r>
-      <w:r>
-        <w:t>-</w:t>
-      </w:r>
-      <w:r>
-        <w:t>499), nhất quán với chênh lệch tổng thể −0,82 pp. Đây là tín hiệu descriptive đáng chú ý nhất của Phase 2.</w:t>
+        <w:t>For D7 retention, gate_30 edges out gate_40 in almost every intermediate bucket (15-29, 30-99, 100-499), consistent with the overall −0.82 pp difference. This is the most notable descriptive signal of Phase 2.</w:t>
       </w:r>
     </w:p>
     <w:p>
@@ -6862,7 +6818,7 @@
           <w:szCs w:val="30"/>
         </w:rPr>
         <w:lastRenderedPageBreak/>
-        <w:t>6. Nhóm 4 — Phát hiện &amp; xử lý Outlier / Anomaly</w:t>
+        <w:t>6. Group 4 — Outlier / Anomaly detection &amp; handling</w:t>
       </w:r>
     </w:p>
     <w:p>
@@ -6876,7 +6832,7 @@
           <w:bCs/>
           <w:color w:val="000000"/>
         </w:rPr>
-        <w:t>6.1. Profiling user cực trị</w:t>
+        <w:t>6.1. Profiling the extreme user</w:t>
       </w:r>
     </w:p>
     <w:p>
@@ -6885,7 +6841,7 @@
         <w:jc w:val="both"/>
       </w:pPr>
       <w:r>
-        <w:t>User có sum_gamerounds lớn nhất: 49.854 rounds trong 14 ngày, tương đương ~3.561 rounds/ngày ≈ 89 giờ chơi mỗi ngày — bất khả thi với người thật. Record: userid 6390605, nhóm gate_30, retention_1 = False, retention_7 = True. Kết hợp bằng chứng khối lượng chơi phi lý → nghi ngờ mạnh là bot/emulator/QA account.</w:t>
+        <w:t>The user with the largest sum_gamerounds: 49,854 rounds in 14 days, equivalent to ~3,561 rounds/day ≈ 89 hours of play each day — impossible for a real person. Record: userid 6390605, gate_30 group, retention_1 = False, retention_7 = True. Combined with the evidence of an absurd play volume → strongly suspected to be a bot/emulator/QA account.</w:t>
       </w:r>
     </w:p>
     <w:p>
@@ -6899,7 +6855,7 @@
           <w:bCs/>
           <w:color w:val="000000"/>
         </w:rPr>
-        <w:t>6.2. Đếm user theo các ngưỡng</w:t>
+        <w:t>6.2. User counts by threshold</w:t>
       </w:r>
     </w:p>
     <w:tbl>
@@ -6958,7 +6914,7 @@
                 <w:sz w:val="24"/>
                 <w:szCs w:val="24"/>
               </w:rPr>
-              <w:t>Ngưỡng</w:t>
+              <w:t>Threshold</w:t>
             </w:r>
           </w:p>
         </w:tc>
@@ -6985,7 +6941,7 @@
                 <w:sz w:val="24"/>
                 <w:szCs w:val="24"/>
               </w:rPr>
-              <w:t>Tổng vượt ngưỡng</w:t>
+              <w:t>Total exceeding threshold</w:t>
             </w:r>
           </w:p>
         </w:tc>
@@ -7173,7 +7129,7 @@
                 <w:sz w:val="24"/>
                 <w:szCs w:val="24"/>
               </w:rPr>
-              <w:t>&gt; 1.000 rounds (~71/ngày)</w:t>
+              <w:t>&gt; 1,000 rounds (~71/day)</w:t>
             </w:r>
           </w:p>
         </w:tc>
@@ -7276,7 +7232,7 @@
                 <w:sz w:val="24"/>
                 <w:szCs w:val="24"/>
               </w:rPr>
-              <w:t>&gt; 3.000 rounds (~214/ngày)</w:t>
+              <w:t>&gt; 3,000 rounds (~214/day)</w:t>
             </w:r>
           </w:p>
         </w:tc>
@@ -7379,7 +7335,7 @@
                 <w:sz w:val="24"/>
                 <w:szCs w:val="24"/>
               </w:rPr>
-              <w:t>&gt; 10.000 rounds</w:t>
+              <w:t>&gt; 10,000 rounds</w:t>
             </w:r>
           </w:p>
         </w:tc>
@@ -7468,13 +7424,7 @@
         <w:jc w:val="both"/>
       </w:pPr>
       <w:r>
-        <w:t>Bảng ngưỡng cho thấy user 49.854 rounds tách biệt hoàn toàn: là user duy nhất vượt cả mốc 3.000 lẫn 10.000 rounds, cách cụm outlier còn lại tới một order of magnitude. Các user 1.000</w:t>
-      </w:r>
-      <w:r>
-        <w:t>-</w:t>
-      </w:r>
-      <w:r>
-        <w:t>3.000 rounds thì mơ hồ (ambiguous) — có thể bot ẩn, có thể heavy user thật, không có bằng chứng phân biệt.</w:t>
+        <w:t>The threshold table shows the 49,854-rounds user is completely separated: it is the only user exceeding both the 3,000 and 10,000 rounds marks, a full order of magnitude away from the rest of the outlier cluster. The 1,000-3,000 rounds users are ambiguous — they could be hidden bots or real heavy users, with no distinguishing evidence.</w:t>
       </w:r>
     </w:p>
     <w:p>
@@ -7553,7 +7503,7 @@
           <w:sz w:val="22"/>
           <w:szCs w:val="22"/>
         </w:rPr>
-        <w:t>Hình 4. Boxplot sum_gamerounds theo nhóm — thang log (trái) hiển thị đầy đủ Q1/Median/Q3, thang tuyến tính giới hạn Y≤500 (phải) để thấy hộp chính.</w:t>
+        <w:t>Figure 4. Boxplot of sum_gamerounds by group — the log scale (left) displays the full Q1/Median/Q3, the linear scale limited to Y≤500 (right) to show the main box.</w:t>
       </w:r>
     </w:p>
     <w:p>
@@ -7562,7 +7512,7 @@
         <w:jc w:val="both"/>
       </w:pPr>
       <w:r>
-        <w:t>Boxplot xác nhận trực quan: hộp chính (Q1=5, Median≈16, Q3≈51) rất nhỏ so với dải tail, và user cực trị nằm tách hẳn khỏi đám đông outlier còn lại.</w:t>
+        <w:t>The boxplot visually confirms: the main box (Q1=5, Median≈16, Q3≈51) is very small compared to the tail range, and the extreme user sits well apart from the rest of the outlier crowd.</w:t>
       </w:r>
     </w:p>
     <w:p>
@@ -7576,7 +7526,7 @@
           <w:bCs/>
           <w:color w:val="000000"/>
         </w:rPr>
-        <w:t>6.4. Sensitivity check — tác động của outlier lên metric chính</w:t>
+        <w:t>6.4. Sensitivity check — the outlier’s impact on the main metrics</w:t>
       </w:r>
     </w:p>
     <w:p>
@@ -7586,7 +7536,7 @@
       </w:pPr>
       <w:r>
         <w:lastRenderedPageBreak/>
-        <w:t>So sánh metric giữa dataset đầy đủ và các phiên bản đã loại outlier để lượng hóa mức ảnh hưởng:</w:t>
+        <w:t>Comparing metrics between the full dataset and the outlier-removed versions to quantify the level of influence:</w:t>
       </w:r>
     </w:p>
     <w:tbl>
@@ -7674,7 +7624,7 @@
                 <w:sz w:val="24"/>
                 <w:szCs w:val="24"/>
               </w:rPr>
-              <w:t>Nhóm</w:t>
+              <w:t>Group</w:t>
             </w:r>
           </w:p>
         </w:tc>
@@ -7813,7 +7763,7 @@
                 <w:sz w:val="24"/>
                 <w:szCs w:val="24"/>
               </w:rPr>
-              <w:t>Đầy đủ</w:t>
+              <w:t>Full</w:t>
             </w:r>
           </w:p>
         </w:tc>
@@ -7861,7 +7811,7 @@
                 <w:sz w:val="24"/>
                 <w:szCs w:val="24"/>
               </w:rPr>
-              <w:t>44,82%</w:t>
+              <w:t>44.82%</w:t>
             </w:r>
           </w:p>
         </w:tc>
@@ -7885,7 +7835,7 @@
                 <w:sz w:val="24"/>
                 <w:szCs w:val="24"/>
               </w:rPr>
-              <w:t>19,02%</w:t>
+              <w:t>19.02%</w:t>
             </w:r>
           </w:p>
         </w:tc>
@@ -7909,7 +7859,7 @@
                 <w:sz w:val="24"/>
                 <w:szCs w:val="24"/>
               </w:rPr>
-              <w:t>52,46</w:t>
+              <w:t>52.46</w:t>
             </w:r>
           </w:p>
         </w:tc>
@@ -7964,7 +7914,7 @@
                 <w:sz w:val="24"/>
                 <w:szCs w:val="24"/>
               </w:rPr>
-              <w:t>Đầy đủ</w:t>
+              <w:t>Full</w:t>
             </w:r>
           </w:p>
         </w:tc>
@@ -8012,7 +7962,7 @@
                 <w:sz w:val="24"/>
                 <w:szCs w:val="24"/>
               </w:rPr>
-              <w:t>44,23%</w:t>
+              <w:t>44.23%</w:t>
             </w:r>
           </w:p>
         </w:tc>
@@ -8036,7 +7986,7 @@
                 <w:sz w:val="24"/>
                 <w:szCs w:val="24"/>
               </w:rPr>
-              <w:t>18,20%</w:t>
+              <w:t>18.20%</w:t>
             </w:r>
           </w:p>
         </w:tc>
@@ -8060,7 +8010,7 @@
                 <w:sz w:val="24"/>
                 <w:szCs w:val="24"/>
               </w:rPr>
-              <w:t>51,30</w:t>
+              <w:t>51.30</w:t>
             </w:r>
           </w:p>
         </w:tc>
@@ -8115,7 +8065,7 @@
                 <w:sz w:val="24"/>
                 <w:szCs w:val="24"/>
               </w:rPr>
-              <w:t>Loại &gt;3.000</w:t>
+              <w:t>Remove &gt;3,000</w:t>
             </w:r>
           </w:p>
         </w:tc>
@@ -8163,7 +8113,7 @@
                 <w:sz w:val="24"/>
                 <w:szCs w:val="24"/>
               </w:rPr>
-              <w:t>44,82%</w:t>
+              <w:t>44.82%</w:t>
             </w:r>
           </w:p>
         </w:tc>
@@ -8187,7 +8137,7 @@
                 <w:sz w:val="24"/>
                 <w:szCs w:val="24"/>
               </w:rPr>
-              <w:t>19,02%</w:t>
+              <w:t>19.02%</w:t>
             </w:r>
           </w:p>
         </w:tc>
@@ -8211,7 +8161,7 @@
                 <w:sz w:val="24"/>
                 <w:szCs w:val="24"/>
               </w:rPr>
-              <w:t>51,34</w:t>
+              <w:t>51.34</w:t>
             </w:r>
           </w:p>
         </w:tc>
@@ -8266,7 +8216,7 @@
                 <w:sz w:val="24"/>
                 <w:szCs w:val="24"/>
               </w:rPr>
-              <w:t>Loại &gt;3.000</w:t>
+              <w:t>Remove &gt;3,000</w:t>
             </w:r>
           </w:p>
         </w:tc>
@@ -8314,7 +8264,7 @@
                 <w:sz w:val="24"/>
                 <w:szCs w:val="24"/>
               </w:rPr>
-              <w:t>44,23%</w:t>
+              <w:t>44.23%</w:t>
             </w:r>
           </w:p>
         </w:tc>
@@ -8338,7 +8288,7 @@
                 <w:sz w:val="24"/>
                 <w:szCs w:val="24"/>
               </w:rPr>
-              <w:t>18,20%</w:t>
+              <w:t>18.20%</w:t>
             </w:r>
           </w:p>
         </w:tc>
@@ -8362,7 +8312,7 @@
                 <w:sz w:val="24"/>
                 <w:szCs w:val="24"/>
               </w:rPr>
-              <w:t>51,30</w:t>
+              <w:t>51.30</w:t>
             </w:r>
           </w:p>
         </w:tc>
@@ -8417,7 +8367,7 @@
                 <w:sz w:val="24"/>
                 <w:szCs w:val="24"/>
               </w:rPr>
-              <w:t>Loại &gt;1.000</w:t>
+              <w:t>Remove &gt;1,000</w:t>
             </w:r>
           </w:p>
         </w:tc>
@@ -8465,7 +8415,7 @@
                 <w:sz w:val="24"/>
                 <w:szCs w:val="24"/>
               </w:rPr>
-              <w:t>44,76%</w:t>
+              <w:t>44.76%</w:t>
             </w:r>
           </w:p>
         </w:tc>
@@ -8489,7 +8439,7 @@
                 <w:sz w:val="24"/>
                 <w:szCs w:val="24"/>
               </w:rPr>
-              <w:t>18,92%</w:t>
+              <w:t>18.92%</w:t>
             </w:r>
           </w:p>
         </w:tc>
@@ -8513,7 +8463,7 @@
                 <w:sz w:val="24"/>
                 <w:szCs w:val="24"/>
               </w:rPr>
-              <w:t>49,83</w:t>
+              <w:t>49.83</w:t>
             </w:r>
           </w:p>
         </w:tc>
@@ -8568,7 +8518,7 @@
                 <w:sz w:val="24"/>
                 <w:szCs w:val="24"/>
               </w:rPr>
-              <w:t>Loại &gt;1.000</w:t>
+              <w:t>Remove &gt;1,000</w:t>
             </w:r>
           </w:p>
         </w:tc>
@@ -8616,7 +8566,7 @@
                 <w:sz w:val="24"/>
                 <w:szCs w:val="24"/>
               </w:rPr>
-              <w:t>44,16%</w:t>
+              <w:t>44.16%</w:t>
             </w:r>
           </w:p>
         </w:tc>
@@ -8640,7 +8590,7 @@
                 <w:sz w:val="24"/>
                 <w:szCs w:val="24"/>
               </w:rPr>
-              <w:t>18,09%</w:t>
+              <w:t>18.09%</w:t>
             </w:r>
           </w:p>
         </w:tc>
@@ -8664,7 +8614,7 @@
                 <w:sz w:val="24"/>
                 <w:szCs w:val="24"/>
               </w:rPr>
-              <w:t>49,53</w:t>
+              <w:t>49.53</w:t>
             </w:r>
           </w:p>
         </w:tc>
@@ -8705,7 +8655,7 @@
         <w:jc w:val="both"/>
       </w:pPr>
       <w:r>
-        <w:t>Retention rate gần như không đổi khi loại outlier (thay đổi ở mức phần trăm thứ hai của điểm phần trăm). Mean rounds nhạy hơn — loại đúng 1 user 49.854 rounds kéo mean gate_30 từ 52,46 xuống 51,34. Vì retention là biến nhị phân, một user chỉ tác động ~0,002 pp lên retention rate.</w:t>
+        <w:t>The retention rate is nearly unchanged when removing the outlier (changing at the second-decimal level of a percentage point). The mean rounds is more sensitive — removing exactly 1 user with 49,854 rounds pulls gate_30’s mean from 52.46 down to 51.34. Because retention is a binary variable, a single user affects the retention rate by only ~0.002 pp.</w:t>
       </w:r>
     </w:p>
     <w:p>
@@ -8719,7 +8669,7 @@
           <w:bCs/>
           <w:color w:val="000000"/>
         </w:rPr>
-        <w:t>6.5. Chốt chính sách xử lý outlier</w:t>
+        <w:t>6.5. Finalizing the outlier handling policy</w:t>
       </w:r>
     </w:p>
     <w:p>
@@ -8732,10 +8682,10 @@
           <w:b/>
           <w:bCs/>
         </w:rPr>
-        <w:t>Quyết định:</w:t>
-      </w:r>
-      <w:r>
-        <w:t xml:space="preserve"> loại đúng 1 user cực trị nhất (ngưỡng sum_gamerounds &gt; 10.000), giữ toàn bộ 90.188 user còn lại (loại 0,0011% dataset).</w:t>
+        <w:t>Decision:</w:t>
+      </w:r>
+      <w:r>
+        <w:t xml:space="preserve"> exclude exactly 1 most-extreme user (threshold sum_gamerounds &gt; 10,000), keep all 90,188 remaining users (removing 0.0011% of the dataset).</w:t>
       </w:r>
     </w:p>
     <w:p>
@@ -8744,13 +8694,7 @@
         <w:jc w:val="both"/>
       </w:pPr>
       <w:r>
-        <w:t>Lý</w:t>
-      </w:r>
-      <w:r>
-        <w:t xml:space="preserve"> </w:t>
-      </w:r>
-      <w:r>
-        <w:t>do:</w:t>
+        <w:t xml:space="preserve">Reasons:</w:t>
       </w:r>
     </w:p>
     <w:p>
@@ -8764,7 +8708,7 @@
         <w:jc w:val="both"/>
       </w:pPr>
       <w:r>
-        <w:t>Chỉ user 49.854 rounds có bằng chứng bot mạnh (89 giờ chơi/ngày, tách biệt một order of magnitude, là user duy nhất vượt 10.000 rounds).</w:t>
+        <w:t>Only the 49,854-rounds user has strong bot evidence (89 hours of play/day, separated by an order of magnitude, the only user exceeding 10,000 rounds).</w:t>
       </w:r>
     </w:p>
     <w:p>
@@ -8778,13 +8722,7 @@
         <w:jc w:val="both"/>
       </w:pPr>
       <w:r>
-        <w:t>Các outlier 1.000</w:t>
-      </w:r>
-      <w:r>
-        <w:t>-</w:t>
-      </w:r>
-      <w:r>
-        <w:t>3.000 rounds là ambiguous, không có bằng chứng phân biệt bot vs heavy user thật → mặc định tin dữ liệu (trust data).</w:t>
+        <w:t>The 1,000-3,000 rounds outliers are ambiguous, with no evidence to distinguish a bot from a real heavy user → default to trusting the data.</w:t>
       </w:r>
     </w:p>
     <w:p>
@@ -8798,13 +8736,7 @@
         <w:jc w:val="both"/>
       </w:pPr>
       <w:r>
-        <w:t>Retention là biến nhị phân nên việc giữ/loại các user 500</w:t>
-      </w:r>
-      <w:r>
-        <w:t>-</w:t>
-      </w:r>
-      <w:r>
-        <w:t>3.000 rounds gần như không đổi kết luận (sensitivity check đã xác nhận).</w:t>
+        <w:t>Because retention is a binary variable, keeping/removing the 500-3,000 rounds users hardly changes the conclusion (the sensitivity check confirmed this).</w:t>
       </w:r>
     </w:p>
     <w:p>
@@ -8818,7 +8750,7 @@
         <w:jc w:val="both"/>
       </w:pPr>
       <w:r>
-        <w:t>Loại dữ liệu tối thiểu = ít rủi ro audit hơn, chỉ cần bảo vệ đúng 1 user duy nhất.</w:t>
+        <w:t>Minimum data removal = less audit risk, only needing to protect exactly 1 user.</w:t>
       </w:r>
     </w:p>
     <w:p>
@@ -8827,7 +8759,7 @@
         <w:jc w:val="both"/>
       </w:pPr>
       <w:r>
-        <w:t xml:space="preserve">Trade-off được chấp nhận: có thể còn bot ẩn dưới ngưỡng 10.000 rounds mà không lọc được, nhưng tác động lên retention rate là không đáng kể. </w:t>
+        <w:t xml:space="preserve">Accepted trade-off: there may still be hidden bots below the 10,000 rounds threshold that cannot be filtered out, but the impact on the retention rate is negligible. </w:t>
       </w:r>
     </w:p>
     <w:p>
@@ -8843,7 +8775,7 @@
           <w:sz w:val="30"/>
           <w:szCs w:val="30"/>
         </w:rPr>
-        <w:t>7. Kết luận &amp; giả định mang sang các phase sau</w:t>
+        <w:t>7. Conclusions &amp; assumptions carried to later phases</w:t>
       </w:r>
     </w:p>
     <w:p>
@@ -8852,7 +8784,7 @@
         <w:jc w:val="both"/>
       </w:pPr>
       <w:r>
-        <w:t>Phase 2 hoàn thành đầy đủ bốn nhóm công việc. Dữ liệu Cookie Cats đạt chuẩn chất lượng để phân tích: sạch, randomization hợp lệ, mọi bất thường đã được ghi nhận cùng policy xử lý bằng văn bản. Không có gate kiểm định nào FAIL, do đó dự án được phép chuyển sang Phase 3.</w:t>
+        <w:t>Phase 2 fully completes the four work groups. The Cookie Cats data meets the quality standard for analysis: clean, valid randomization, every anomaly recorded with a written handling policy. No validation gate FAILED, so the project is permitted to proceed to Phase 3.</w:t>
       </w:r>
     </w:p>
     <w:p>
@@ -8862,7 +8794,7 @@
       </w:pPr>
       <w:r>
         <w:lastRenderedPageBreak/>
-        <w:t>Ba giả định/lưu ý bắt buộc mang theo và công bố ở các báo cáo sau:</w:t>
+        <w:t>Three mandatory assumptions/notes to carry forward and disclose in later reports:</w:t>
       </w:r>
     </w:p>
     <w:p>
@@ -8880,10 +8812,10 @@
           <w:b/>
           <w:bCs/>
         </w:rPr>
-        <w:t>Retention theo dõi lượt mở app, không phải lượt chơi</w:t>
-      </w:r>
-      <w:r>
-        <w:t xml:space="preserve"> — suy ra từ 87 user 0-round-nhưng-retained. Ảnh hưởng đến cách diễn giải chỉ số retention.</w:t>
+        <w:t>Retention tracks app opens, not rounds played</w:t>
+      </w:r>
+      <w:r>
+        <w:t xml:space="preserve"> — inferred from the 87 users with 0-rounds-but-retained. Affects how the retention metric is interpreted.</w:t>
       </w:r>
     </w:p>
     <w:p>
@@ -8901,10 +8833,10 @@
           <w:b/>
           <w:bCs/>
         </w:rPr>
-        <w:t>Dữ liệu lệch phải mạnh, không normal</w:t>
-      </w:r>
-      <w:r>
-        <w:t xml:space="preserve"> — Phase 4 phải dùng Mann-Whitney U và bootstrap, không dùng t-test; cân nhắc Bonferroni correction (α = 0,0167) cho 3 test đồng thời.</w:t>
+        <w:t>The data is strongly right-skewed, not normal</w:t>
+      </w:r>
+      <w:r>
+        <w:t xml:space="preserve"> — Phase 4 must use Mann-Whitney U and bootstrap, not a t-test; consider a Bonferroni correction (α = 0.0167) for the 3 simultaneous tests.</w:t>
       </w:r>
     </w:p>
     <w:p>
@@ -8922,10 +8854,10 @@
           <w:b/>
           <w:bCs/>
         </w:rPr>
-        <w:t>Đã loại 1 outlier (userid 6390605)</w:t>
-      </w:r>
-      <w:r>
-        <w:t xml:space="preserve"> — mọi phân tích Phase 3+ chạy trên 90.188 user; cần re-check SRM sau khi loại.</w:t>
+        <w:t>1 outlier removed (userid 6390605)</w:t>
+      </w:r>
+      <w:r>
+        <w:t xml:space="preserve"> — every Phase 3+ analysis runs on 90,188 users; SRM must be re-checked after removal.</w:t>
       </w:r>
     </w:p>
     <w:p>
@@ -8934,7 +8866,7 @@
         <w:jc w:val="both"/>
       </w:pPr>
       <w:r>
-        <w:t>Tín hiệu descriptive (chưa kiểm định): gate_40 có retention D1 thấp hơn 0,59 pp và D7 thấp hơn 0,82 pp, hướng chênh lệch âm nhất quán. Nếu được xác nhận có ý nghĩa thống kê ở Phase 4, đây sẽ là cơ sở cho khuyến nghị No-Go với việc dời gate.</w:t>
+        <w:t>Descriptive signal (not yet tested): gate_40 has D1 retention 0.59 pp lower and D7 0.82 pp lower, with a consistent negative direction of difference. If confirmed statistically significant in Phase 4, this will be the basis for a No-Go recommendation on moving the gate.</w:t>
       </w:r>
     </w:p>
     <w:p>
@@ -8948,7 +8880,7 @@
           <w:bCs/>
           <w:color w:val="000000"/>
         </w:rPr>
-        <w:t>Bước tiếp theo — Phase 3 (Data Preparation)</w:t>
+        <w:t>Next step — Phase 3 (Data Preparation)</w:t>
       </w:r>
     </w:p>
     <w:p>
@@ -8957,7 +8889,7 @@
         <w:jc w:val="both"/>
       </w:pPr>
       <w:r>
-        <w:t>Xây dựng mart_ab_test_base trên SQL Server: áp policy khử trùng lặp và loại outlier, tạo engagement_bucket (light ≤ p33 &lt; medium ≤ p67 &lt; heavy) và log_sum_gamerounds = LOG(sum_gamerounds + 1), rồi chạy bộ validation query (VAL-1 → VAL-8) trước khi sang Phase 4.</w:t>
+        <w:t>Build mart_ab_test_base on SQL Server: apply the deduplication and outlier removal policies, create engagement_bucket (light ≤ p33 &lt; medium ≤ p67 &lt; heavy) and log_sum_gamerounds = LOG(sum_gamerounds + 1), then run the validation query set (VAL-1 → VAL-8) before moving to Phase 4.</w:t>
       </w:r>
     </w:p>
     <w:p>
@@ -8973,7 +8905,7 @@
           <w:sz w:val="30"/>
           <w:szCs w:val="30"/>
         </w:rPr>
-        <w:t>Phụ lục — Nguồn kết quả &amp; biểu đồ</w:t>
+        <w:t>Appendix — Source of results &amp; charts</w:t>
       </w:r>
     </w:p>
     <w:p>
@@ -8982,7 +8914,7 @@
         <w:jc w:val="both"/>
       </w:pPr>
       <w:r>
-        <w:t>Toàn bộ số liệu và biểu đồ trong báo cáo được sinh ra từ các notebook Python (thư mục notebooks/) và lưu tại thư mục reports/:</w:t>
+        <w:t>All the figures and charts in this report are generated from the Python notebooks (the notebooks/ folder) and saved in the reports/ folder:</w:t>
       </w:r>
     </w:p>
     <w:p>
@@ -8996,7 +8928,7 @@
         <w:jc w:val="both"/>
       </w:pPr>
       <w:r>
-        <w:t>phase2_01_data_integrity_check.ipynb — Nhóm 1</w:t>
+        <w:t>phase2_01_data_integrity_check.ipynb — Group 1</w:t>
       </w:r>
     </w:p>
     <w:p>
@@ -9010,7 +8942,7 @@
         <w:jc w:val="both"/>
       </w:pPr>
       <w:r>
-        <w:t>phase2_02_srm_check.ipynb — Nhóm 2</w:t>
+        <w:t>phase2_02_srm_check.ipynb — Group 2</w:t>
       </w:r>
     </w:p>
     <w:p>
@@ -9024,7 +8956,7 @@
         <w:jc w:val="both"/>
       </w:pPr>
       <w:r>
-        <w:t>phase2_03_distribution_analysis.ipynb — Nhóm 3 (Hình 1, 2, 3)</w:t>
+        <w:t>phase2_03_distribution_analysis.ipynb — Group 3 (Figures 1, 2, 3)</w:t>
       </w:r>
     </w:p>
     <w:p>
@@ -9038,7 +8970,7 @@
         <w:jc w:val="both"/>
       </w:pPr>
       <w:r>
-        <w:t>phase2_04_outlier_anomaly.ipynb — Nhóm 4 (Hình 4)</w:t>
+        <w:t>phase2_04_outlier_anomaly.ipynb — Group 4 (Figure 4)</w:t>
       </w:r>
     </w:p>
     <w:p>
@@ -9052,13 +8984,7 @@
         <w:jc w:val="both"/>
       </w:pPr>
       <w:r>
-        <w:t>Biểu</w:t>
-      </w:r>
-      <w:r>
-        <w:t xml:space="preserve"> </w:t>
-      </w:r>
-      <w:r>
-        <w:t>đồ PNG: phase2_histogram_gamerounds.png, phase2_pareto.png, phase2_retention_by_bucket.png, phase2_boxplot_minor_ticks.png</w:t>
+        <w:t xml:space="preserve">PNG charts: phase2_histogram_gamerounds.png, phase2_pareto.png, phase2_retention_by_bucket.png, phase2_boxplot_minor_ticks.png</w:t>
       </w:r>
     </w:p>
     <w:sectPr>
@@ -9110,7 +9036,7 @@
         <w:sz w:val="18"/>
         <w:szCs w:val="18"/>
       </w:rPr>
-      <w:t xml:space="preserve">Trang </w:t>
+      <w:t xml:space="preserve">Page </w:t>
     </w:r>
     <w:r>
       <w:rPr>
@@ -9246,7 +9172,7 @@
         <w:sz w:val="18"/>
         <w:szCs w:val="18"/>
       </w:rPr>
-      <w:t>Cookie Cats A/B Test — Báo cáo Phase 2 (EDA &amp; Data Quality)</w:t>
+      <w:t>Cookie Cats A/B Test — Phase 2 Report (EDA &amp; Data Quality)</w:t>
     </w:r>
   </w:p>
 </w:hdr>

</xml_diff>